<commit_message>
Tighten LSTM section prose in final report
</commit_message>
<xml_diff>
--- a/Team5-Final-Report.docx
+++ b/Team5-Final-Report.docx
@@ -268,38 +268,15 @@
         <w:spacing w:line="480" w:lineRule="auto" w:before="0" w:after="0"/>
       </w:pPr>
       <w:r>
-        <w:t xml:space="preserve">Each filtered MIDI file was parsed into a sequence of notes using the </w:t>
-      </w:r>
-      <w:proofErr w:type="spellStart"/>
-      <w:r>
-        <w:t>pretty_midi</w:t>
-      </w:r>
-      <w:proofErr w:type="spellEnd"/>
-      <w:r>
-        <w:t xml:space="preserve"> library. For every file, notes from all non-drum instrument tracks were pooled and sorted by start time, producing a single chronological sequence per piece rather than separate sequences per voice. Four arrays were extracted per note: pitch (MIDI note number), duration (note end time minus start time), velocity, and offset (time elapsed since the previous note's start, with the first note assigned an offset of zero). These four arrays were saved per piece as a compressed .</w:t>
-      </w:r>
-      <w:proofErr w:type="spellStart"/>
-      <w:r>
-        <w:t>npz</w:t>
-      </w:r>
-      <w:proofErr w:type="spellEnd"/>
-      <w:r>
-        <w:t xml:space="preserve"> file, avoiding the</w:t>
-      </w:r>
-      <w:r>
-        <w:t xml:space="preserve"> need to re-parse MIDI files on every subsequent run.</w:t>
-      </w:r>
-    </w:p>
-    <w:p>
-      <w:pPr>
-        <w:spacing w:line="480" w:lineRule="auto" w:before="0" w:after="0"/>
-      </w:pPr>
-      <w:r>
-        <w:t xml:space="preserve">Sequence length varied widely across the dataset, from roughly 80 notes to over 40,000, since piece length and note density differ substantially by composer and by piece. This variation was left unresolved at the parsing stage and flagged as a requirement for the </w:t>
-      </w:r>
-      <w:r>
-        <w:lastRenderedPageBreak/>
-        <w:t>model-building step, which would need to apply padding or truncation to produce fixed-length model inputs. Two of the 1,637 files failed to parse due to corrupted key-signature metadata and were excluded, leaving 1,635 usable files for the LSTM pipeline.</w:t>
+        <w:t xml:space="preserve">pretty_midi parsed each filtered MIDI file into a note sequence. Notes from every non-drum track were pooled and sorted by start time, giving one chronological sequence per piece instead of one per voice. Each note kept four values: pitch, duration, velocity, and offset (time since the previous note, zero for the first). We cached these arrays per piece as compressed .npz files so later runs skip re-parsing.</w:t>
+      </w:r>
+    </w:p>
+    <w:p>
+      <w:pPr>
+        <w:spacing w:line="480" w:lineRule="auto" w:before="0" w:after="0"/>
+      </w:pPr>
+      <w:r>
+        <w:t xml:space="preserve">Sequence length ranged from about 80 notes to over 40,000, since note density varies by composer and by piece. We left that alone at parsing and pushed padding and truncation to the model stage. Two of the 1,637 files failed to parse (corrupted key-signature metadata) and were dropped, leaving 1,635 usable files.</w:t>
       </w:r>
     </w:p>
     <w:p>
@@ -424,57 +401,15 @@
         <w:spacing w:line="480" w:lineRule="auto" w:before="0" w:after="0"/>
       </w:pPr>
       <w:r>
-        <w:t xml:space="preserve">Our LSTM model </w:t>
-      </w:r>
-      <w:proofErr w:type="gramStart"/>
-      <w:r>
-        <w:t>takes</w:t>
-      </w:r>
-      <w:proofErr w:type="gramEnd"/>
-      <w:r>
-        <w:t xml:space="preserve"> two inputs. Pitch is fed through an embedding layer (128 vocabulary, 16 dimensions, with masking on the padding value) rather than scaled as a floating-point magnitude, since a composer's harmonic language lives in the intervals between pitch classes rather than in absolute pitch height. Duration, velocity, and offset are fed as continuous features and concatenated with the pitch embedding at every timestep. Each input sequence is the first 500 note events of a piece, zero-padded and masked </w:t>
-      </w:r>
-      <w:proofErr w:type="gramStart"/>
-      <w:r>
-        <w:t>where</w:t>
-      </w:r>
-      <w:proofErr w:type="gramEnd"/>
-      <w:r>
-        <w:t xml:space="preserve"> shor</w:t>
-      </w:r>
-      <w:r>
-        <w:t xml:space="preserve">ter. The concatenated sequence passes through a 128-unit LSTM layer returning full sequences, dropout of 0.3, a second 64-unit LSTM layer, dropout of 0.3, and a final 4-class </w:t>
-      </w:r>
-      <w:proofErr w:type="spellStart"/>
-      <w:r>
-        <w:t>softmax</w:t>
-      </w:r>
-      <w:proofErr w:type="spellEnd"/>
-      <w:r>
-        <w:t xml:space="preserve"> output. We trained with sparse categorical cross-entropy loss and the Adam optimizer at a learning rate of 0.0005 with gradient-norm clipping at 1.0, which became necessary after an early version diverged partway through training. Class weights were computed from the </w:t>
-      </w:r>
-      <w:proofErr w:type="spellStart"/>
-      <w:r>
-        <w:t>unaugmented</w:t>
-      </w:r>
-      <w:proofErr w:type="spellEnd"/>
-      <w:r>
-        <w:t xml:space="preserve"> training counts, since the pitch-shift augmentati</w:t>
-      </w:r>
-      <w:r>
-        <w:t>on described above already rebalances the class ratio and weighting on top of it would double-correct. Single-split training ran for up to 100 epochs with early stopping on validation accuracy (patience 12) and learning-rate reduction on a validation-loss plateau; the cross-validation folds described below used a shorter 60-epoch budget per fold.</w:t>
-      </w:r>
-    </w:p>
-    <w:p>
-      <w:pPr>
-        <w:spacing w:line="480" w:lineRule="auto" w:before="0" w:after="0"/>
-      </w:pPr>
-      <w:r>
-        <w:lastRenderedPageBreak/>
-        <w:t>On the original file-level split, the LSTM reached 48.8% accuracy, with macro precision of 51.2% and macro recall of 32.3%, against a majority-class (always-Bach) baseline of 62.6%. Because the work-leakage review above found that 14-16% of validation and test rows shared a work with a training file, we re-evaluated the LSTM on the work-grouped split using 5-fold cross-validation plus a held-out test set that no training fold ever touches. Cross-validation accuracy was 55.4% (SD 6.2%) with macro F1 of 40.9%</w:t>
-      </w:r>
-      <w:r>
-        <w:t xml:space="preserve"> (SD 6.2%) across folds ranging from 47.5% to 63.0%, and the final holdout evaluation scored 45.3% accuracy and 42.6% macro F1 against a 62.4% majority-class baseline on that split. Figure 1 (generated with matplotlib; Hunter, 2007) shows the single-split training curves; Figure 2 and Table 1 show the holdout confusion matrix and per-class results.</w:t>
+        <w:t xml:space="preserve">The LSTM takes two input streams. Pitch goes through an embedding layer (128 vocabulary, 16 dimensions, padding masked) instead of a raw float, since a composer's harmonic language sits in the intervals between pitches, not their absolute height. Duration, velocity, and offset feed in as continuous values, concatenated with the pitch embedding at every timestep. Each sequence is capped at the first 500 note events, zero-padded and masked when shorter. That combined sequence runs through a 128-unit LSTM (full sequences returned), 0.3 dropout, a 64-unit LSTM, another 0.3 dropout, then a 4-class softmax. We trained with sparse categorical cross-entropy and Adam at lr=0.0005, clipping gradients at 1.0 after an early run diverged mid-training. Class weights came from the unaugmented counts: augmentation already rebalances the classes, so weighting on top would double-correct. Single-split training ran up to 100 epochs with early stopping (patience 12) and LR reduction on a validation-loss plateau; cross-validation folds used a tighter 60-epoch budget.</w:t>
+      </w:r>
+    </w:p>
+    <w:p>
+      <w:pPr>
+        <w:spacing w:line="480" w:lineRule="auto" w:before="0" w:after="0"/>
+      </w:pPr>
+      <w:r>
+        <w:t xml:space="preserve">On the original file-level split, the LSTM hit 48.8% accuracy (macro precision 51.2%, macro recall 32.3%) against a 62.6% always-Bach baseline. Since the leakage review found 14-16% of validation/test rows shared a work with a training file, we re-ran the LSTM on the work-grouped split: 5-fold cross-validation plus a holdout set no fold ever trains on. Cross-validation accuracy came to 55.4% (SD 6.2%), macro F1 40.9% (SD 6.2%), folds ranging 47.5% to 63.0%; the final holdout scored 45.3% accuracy and 42.6% macro F1 against a 62.4% baseline. Figure 1 (matplotlib; Hunter, 2007) shows the single-split training curves; Figure 2 and Table 1 show the holdout confusion matrix and per-class breakdown.</w:t>
       </w:r>
     </w:p>
     <w:p>
@@ -3149,42 +3084,9 @@
           <w:lang w:val="en-US"/>
         </w:rPr>
       </w:pPr>
-      <w:proofErr w:type="spellStart"/>
-      <w:r>
-        <w:rPr>
-          <w:lang w:val="en-US"/>
-        </w:rPr>
-        <w:t xml:space="preserve">TensorFlow Developers. (n.d.). TensorFlow [Computer software]. </w:t>
-      </w:r>
-      <w:proofErr w:type="spellEnd"/>
-      <w:r>
-        <w:rPr>
-          <w:lang w:val="en-US"/>
-        </w:rPr>
-      </w:r>
-      <w:proofErr w:type="spellStart"/>
-      <w:r>
-        <w:rPr>
-          <w:i/>
-          <w:iCs/>
-          <w:lang w:val="en-US"/>
-        </w:rPr>
-      </w:r>
-      <w:proofErr w:type="spellEnd"/>
-      <w:r>
-        <w:rPr>
-          <w:lang w:val="en-US"/>
-        </w:rPr>
-      </w:r>
-      <w:hyperlink r:id="rId12" w:history="1">
-        <w:r>
-          <w:rPr>
-            <w:rStyle w:val="Hyperlink"/>
-            <w:lang w:val="en-US"/>
-          </w:rPr>
-          <w:t>https://www.tensorflow.org/</w:t>
-        </w:r>
-      </w:hyperlink>
+      <w:r>
+        <w:t xml:space="preserve">The LSTM loses to the majority-class baseline on both splits. Bach precision is 0.91 but recall only 0.42: the model is right when it says Bach, but misses most actual Bach pieces, mostly mislabeling them Mozart (76 of 146 in the holdout, Figure 2). It also hasn't converged: three of five cross-validation folds hit the 60-epoch cap still improving, so we don't yet know this architecture's ceiling. Full histories, per-fold metrics, and the model-development defect log are in the project notebooks (05_lstm_model.ipynb, 08_cross_validation.ipynb).</w:t>
+      </w:r>
     </w:p>
     <w:sectPr>
       <w:headerReference w:type="default" r:id="rId15"/>

</xml_diff>

<commit_message>
Add AI disclosure, combined pipeline notebook, and fix split seed bug
- Add AI Disclosure section to Team5-Final-Report.docx covering AI use in
  drafting/formatting and AI-built scripts for repetitive checks.
- Add notebooks/Composer_Prediction_Combined.ipynb: merges the 02-08 pipeline
  notebooks into one end-to-end notebook, with its own AI disclosure cell.
- Fix non-deterministic train/val/test split in 04_split_and_augment.ipynb:
  sort the file-key set before building files_df so train_test_split's fixed
  random_state actually produces a reproducible split across runs.
</commit_message>
<xml_diff>
--- a/Team5-Final-Report.docx
+++ b/Team5-Final-Report.docx
@@ -2734,6 +2734,20 @@
       </w:pPr>
       <w:r>
         <w:t xml:space="preserve"> </w:t>
+      </w:r>
+    </w:p>
+    <w:p>
+      <w:pPr>
+        <w:pStyle w:val="Heading1"/>
+      </w:pPr>
+      <w:r>
+        <w:t>AI Disclosure</w:t>
+      </w:r>
+    </w:p>
+    <w:p>
+      <w:pPr/>
+      <w:r>
+        <w:t>Generative AI tools (including Claude and ChatGPT) were used extensively throughout the drafting and revision of this report to help align the writing, formatting, and reported results with the outputs of our analysis notebook. AI-assisted scripts and tools were also used to repeatedly re-check tedious, repetitive tasks such as formatting consistency, citation/reference formatting, and numbering. All analysis, modeling, and conclusions remain the work and responsibility of the team.</w:t>
       </w:r>
     </w:p>
     <w:p>

</xml_diff>